<commit_message>
fix/correcting styles in the document header
</commit_message>
<xml_diff>
--- a/templates/Письмо о допуске.docx
+++ b/templates/Письмо о допуске.docx
@@ -165,6 +165,31 @@
                 <w:b/>
                 <w:lang w:eastAsia="en-US"/>
               </w:rPr>
+              <w:t>} {</w:t>
+            </w:r>
+            <w:proofErr w:type="spellStart"/>
+            <w:proofErr w:type="gramStart"/>
+            <w:r>
+              <w:rPr>
+                <w:b/>
+                <w:lang w:eastAsia="en-US"/>
+              </w:rPr>
+              <w:t>адресат.организация</w:t>
+            </w:r>
+            <w:proofErr w:type="gramEnd"/>
+            <w:r>
+              <w:rPr>
+                <w:b/>
+                <w:lang w:eastAsia="en-US"/>
+              </w:rPr>
+              <w:t>_из_формы</w:t>
+            </w:r>
+            <w:proofErr w:type="spellEnd"/>
+            <w:r>
+              <w:rPr>
+                <w:b/>
+                <w:lang w:eastAsia="en-US"/>
+              </w:rPr>
               <w:t>}</w:t>
             </w:r>
           </w:p>
@@ -197,7 +222,7 @@
                 <w:b/>
                 <w:bCs/>
               </w:rPr>
-              <w:t>адресат.фио</w:t>
+              <w:t>адресат.Фио</w:t>
             </w:r>
             <w:proofErr w:type="gramEnd"/>
             <w:r>
@@ -527,7 +552,7 @@
         <w:rPr>
           <w:b/>
         </w:rPr>
-        <w:t>адресат.фио</w:t>
+        <w:t>адресат.ИО</w:t>
       </w:r>
       <w:proofErr w:type="gramEnd"/>
       <w:r>
@@ -584,19 +609,30 @@
         <w:t>у</w:t>
       </w:r>
       <w:r>
-        <w:t xml:space="preserve"> ООО</w:t>
-      </w:r>
-      <w:r>
-        <w:t> </w:t>
-      </w:r>
-      <w:r>
-        <w:t>«</w:t>
-      </w:r>
-      <w:r>
-        <w:t>Мяу мышь</w:t>
-      </w:r>
-      <w:r>
-        <w:t xml:space="preserve">» согласно Приложению №1 в период с </w:t>
+        <w:t xml:space="preserve"> </w:t>
+      </w:r>
+      <w:r>
+        <w:rPr>
+          <w:bCs/>
+        </w:rPr>
+        <w:t>{</w:t>
+      </w:r>
+      <w:proofErr w:type="spellStart"/>
+      <w:r>
+        <w:rPr>
+          <w:bCs/>
+        </w:rPr>
+        <w:t>адресат.организация_из_формы</w:t>
+      </w:r>
+      <w:proofErr w:type="spellEnd"/>
+      <w:r>
+        <w:rPr>
+          <w:bCs/>
+        </w:rPr>
+        <w:t>}</w:t>
+      </w:r>
+      <w:r>
+        <w:t xml:space="preserve"> согласно Приложению №1 в период с </w:t>
       </w:r>
       <w:r>
         <w:rPr>
@@ -839,13 +875,13 @@
               <w:bottom w:w="0" w:type="dxa"/>
               <w:right w:w="108" w:type="dxa"/>
             </w:tcMar>
+            <w:vAlign w:val="bottom"/>
             <w:hideMark/>
           </w:tcPr>
           <w:p>
             <w:pPr>
               <w:spacing w:line="300" w:lineRule="auto"/>
               <w:ind w:right="284"/>
-              <w:jc w:val="both"/>
               <w:rPr>
                 <w:highlight w:val="green"/>
               </w:rPr>
@@ -855,32 +891,54 @@
             <w:pPr>
               <w:spacing w:line="300" w:lineRule="auto"/>
               <w:ind w:right="284"/>
-              <w:jc w:val="both"/>
-              <w:rPr>
-                <w:highlight w:val="red"/>
-              </w:rPr>
-            </w:pPr>
-            <w:r>
-              <w:rPr>
-                <w:highlight w:val="red"/>
-              </w:rPr>
-              <w:t xml:space="preserve">Заместитель директора </w:t>
-            </w:r>
-          </w:p>
-          <w:p>
-            <w:pPr>
-              <w:spacing w:line="300" w:lineRule="auto"/>
-              <w:ind w:right="284"/>
-              <w:jc w:val="both"/>
               <w:rPr>
                 <w:highlight w:val="green"/>
               </w:rPr>
             </w:pPr>
             <w:r>
               <w:rPr>
-                <w:highlight w:val="red"/>
+                <w:lang w:val="en-US"/>
               </w:rPr>
-              <w:t>департамента управления проектами</w:t>
+              <w:t>{</w:t>
+            </w:r>
+            <w:proofErr w:type="spellStart"/>
+            <w:proofErr w:type="gramStart"/>
+            <w:r>
+              <w:rPr>
+                <w:lang w:val="en-US"/>
+              </w:rPr>
+              <w:t>подписант</w:t>
+            </w:r>
+            <w:proofErr w:type="spellEnd"/>
+            <w:r>
+              <w:rPr>
+                <w:lang w:val="en-US"/>
+              </w:rPr>
+              <w:t>.</w:t>
+            </w:r>
+            <w:r>
+              <w:t>должность</w:t>
+            </w:r>
+            <w:proofErr w:type="gramEnd"/>
+            <w:r>
+              <w:rPr>
+                <w:lang w:val="en-US"/>
+              </w:rPr>
+              <w:t>_</w:t>
+            </w:r>
+            <w:proofErr w:type="spellStart"/>
+            <w:r>
+              <w:rPr>
+                <w:lang w:val="en-US"/>
+              </w:rPr>
+              <w:t>из_формы</w:t>
+            </w:r>
+            <w:proofErr w:type="spellEnd"/>
+            <w:r>
+              <w:rPr>
+                <w:lang w:val="en-US"/>
+              </w:rPr>
+              <w:t>}</w:t>
             </w:r>
           </w:p>
         </w:tc>
@@ -926,13 +984,8 @@
               <w:t>{</w:t>
             </w:r>
             <w:proofErr w:type="spellStart"/>
-            <w:proofErr w:type="gramStart"/>
             <w:r>
-              <w:t>подписант.фио</w:t>
-            </w:r>
-            <w:proofErr w:type="gramEnd"/>
-            <w:r>
-              <w:t>_из_формы</w:t>
+              <w:t>подписант.фио_из_формы</w:t>
             </w:r>
             <w:proofErr w:type="spellEnd"/>
             <w:r>
@@ -1109,37 +1162,30 @@
       <w:r>
         <w:rPr>
           <w:b/>
-          <w:highlight w:val="red"/>
         </w:rPr>
-        <w:t>ООО</w:t>
-      </w:r>
+        <w:t>{</w:t>
+      </w:r>
+      <w:proofErr w:type="spellStart"/>
+      <w:proofErr w:type="gramStart"/>
       <w:r>
         <w:rPr>
           <w:b/>
-          <w:highlight w:val="red"/>
         </w:rPr>
-        <w:t> </w:t>
-      </w:r>
+        <w:t>адресат.организация</w:t>
+      </w:r>
+      <w:proofErr w:type="gramEnd"/>
       <w:r>
         <w:rPr>
           <w:b/>
-          <w:highlight w:val="red"/>
         </w:rPr>
-        <w:t>«</w:t>
-      </w:r>
+        <w:t>_из_формы</w:t>
+      </w:r>
+      <w:proofErr w:type="spellEnd"/>
       <w:r>
         <w:rPr>
           <w:b/>
-          <w:highlight w:val="red"/>
         </w:rPr>
-        <w:t>Мяу мышь</w:t>
-      </w:r>
-      <w:r>
-        <w:rPr>
-          <w:b/>
-          <w:highlight w:val="red"/>
-        </w:rPr>
-        <w:t>»</w:t>
+        <w:t>}</w:t>
       </w:r>
       <w:r>
         <w:rPr>
@@ -1156,14 +1202,15 @@
         <w:tblLook w:val="04A0" w:firstRow="1" w:lastRow="0" w:firstColumn="1" w:lastColumn="0" w:noHBand="0" w:noVBand="1"/>
       </w:tblPr>
       <w:tblGrid>
-        <w:gridCol w:w="567"/>
-        <w:gridCol w:w="3260"/>
-        <w:gridCol w:w="3260"/>
-        <w:gridCol w:w="2874"/>
+        <w:gridCol w:w="565"/>
+        <w:gridCol w:w="2725"/>
+        <w:gridCol w:w="2753"/>
+        <w:gridCol w:w="3918"/>
       </w:tblGrid>
       <w:tr>
         <w:trPr>
           <w:trHeight w:val="648"/>
+          <w:tblHeader/>
         </w:trPr>
         <w:tc>
           <w:tcPr>
@@ -1278,54 +1325,31 @@
             <w:r>
               <w:rPr>
                 <w:b/>
-                <w:highlight w:val="red"/>
                 <w:lang w:eastAsia="en-US"/>
               </w:rPr>
-              <w:t>ООО</w:t>
+              <w:t>{</w:t>
             </w:r>
+            <w:proofErr w:type="spellStart"/>
             <w:r>
               <w:rPr>
                 <w:b/>
-                <w:highlight w:val="red"/>
                 <w:lang w:eastAsia="en-US"/>
               </w:rPr>
-              <w:t> </w:t>
+              <w:t>адресат.организация_из_формы</w:t>
             </w:r>
+            <w:proofErr w:type="spellEnd"/>
             <w:r>
               <w:rPr>
                 <w:b/>
-                <w:highlight w:val="red"/>
                 <w:lang w:eastAsia="en-US"/>
               </w:rPr>
-              <w:t>«</w:t>
-            </w:r>
-            <w:r>
-              <w:rPr>
-                <w:b/>
-                <w:highlight w:val="red"/>
-                <w:lang w:eastAsia="en-US"/>
-              </w:rPr>
-              <w:t>Мяу мышь</w:t>
-            </w:r>
-            <w:r>
-              <w:rPr>
-                <w:b/>
-                <w:highlight w:val="red"/>
-                <w:lang w:eastAsia="en-US"/>
-              </w:rPr>
-              <w:t>»</w:t>
+              <w:t>}</w:t>
             </w:r>
           </w:p>
         </w:tc>
       </w:tr>
     </w:tbl>
-    <w:p>
-      <w:pPr>
-        <w:rPr>
-          <w:lang w:val="en-US"/>
-        </w:rPr>
-      </w:pPr>
-    </w:p>
+    <w:p/>
     <w:sectPr>
       <w:footerReference w:type="default" r:id="rId14"/>
       <w:pgSz w:w="11906" w:h="16838"/>
@@ -5714,15 +5738,6 @@
 </file>
 
 <file path=customXml/item1.xml><?xml version="1.0" encoding="utf-8"?>
-<?mso-contentType ?>
-<FormTemplates xmlns="http://schemas.microsoft.com/sharepoint/v3/contenttype/forms">
-  <Display>DocumentLibraryForm</Display>
-  <Edit>DocumentLibraryForm</Edit>
-  <New>DocumentLibraryForm</New>
-</FormTemplates>
-</file>
-
-<file path=customXml/item2.xml><?xml version="1.0" encoding="utf-8"?>
 <ct:contentTypeSchema xmlns:ct="http://schemas.microsoft.com/office/2006/metadata/contentType" xmlns:ma="http://schemas.microsoft.com/office/2006/metadata/properties/metaAttributes" ct:_="" ma:_="" ma:contentTypeName="Документ" ma:contentTypeID="0x010100B15E35102212134085CC5290C7ADDEE8" ma:contentTypeVersion="" ma:contentTypeDescription="Создание документа." ma:contentTypeScope="" ma:versionID="23ef4a7d3656270976f642a5c04bc894">
   <xsd:schema xmlns:xsd="http://www.w3.org/2001/XMLSchema" xmlns:xs="http://www.w3.org/2001/XMLSchema" xmlns:p="http://schemas.microsoft.com/office/2006/metadata/properties" targetNamespace="http://schemas.microsoft.com/office/2006/metadata/properties" ma:root="true" ma:fieldsID="bd6a377878e0051e83f3802f19165a7e">
     <xsd:element name="properties">
@@ -5836,25 +5851,26 @@
 </ct:contentTypeSchema>
 </file>
 
+<file path=customXml/item2.xml><?xml version="1.0" encoding="utf-8"?>
+<?mso-contentType ?>
+<FormTemplates xmlns="http://schemas.microsoft.com/sharepoint/v3/contenttype/forms">
+  <Display>DocumentLibraryForm</Display>
+  <Edit>DocumentLibraryForm</Edit>
+  <New>DocumentLibraryForm</New>
+</FormTemplates>
+</file>
+
 <file path=customXml/item3.xml><?xml version="1.0" encoding="utf-8"?>
+<b:Sources xmlns:b="http://schemas.openxmlformats.org/officeDocument/2006/bibliography" xmlns="http://schemas.openxmlformats.org/officeDocument/2006/bibliography" SelectedStyle="\APASixthEditionOfficeOnline.xsl" StyleName="APA" Version="6"/>
+</file>
+
+<file path=customXml/item4.xml><?xml version="1.0" encoding="utf-8"?>
 <p:properties xmlns:p="http://schemas.microsoft.com/office/2006/metadata/properties" xmlns:xsi="http://www.w3.org/2001/XMLSchema-instance" xmlns:pc="http://schemas.microsoft.com/office/infopath/2007/PartnerControls">
   <documentManagement/>
 </p:properties>
 </file>
 
-<file path=customXml/item4.xml><?xml version="1.0" encoding="utf-8"?>
-<b:Sources xmlns:b="http://schemas.openxmlformats.org/officeDocument/2006/bibliography" xmlns="http://schemas.openxmlformats.org/officeDocument/2006/bibliography" SelectedStyle="\APASixthEditionOfficeOnline.xsl" StyleName="APA" Version="6"/>
-</file>
-
 <file path=customXml/itemProps1.xml><?xml version="1.0" encoding="utf-8"?>
-<ds:datastoreItem xmlns:ds="http://schemas.openxmlformats.org/officeDocument/2006/customXml" ds:itemID="{87F1C887-7AFD-4A86-9F7E-A098FD4F3E64}">
-  <ds:schemaRefs>
-    <ds:schemaRef ds:uri="http://schemas.microsoft.com/sharepoint/v3/contenttype/forms"/>
-  </ds:schemaRefs>
-</ds:datastoreItem>
-</file>
-
-<file path=customXml/itemProps2.xml><?xml version="1.0" encoding="utf-8"?>
 <ds:datastoreItem xmlns:ds="http://schemas.openxmlformats.org/officeDocument/2006/customXml" ds:itemID="{E17926B8-577F-4215-A867-5C51859A31FF}">
   <ds:schemaRefs>
     <ds:schemaRef ds:uri="http://schemas.microsoft.com/office/2006/metadata/contentType"/>
@@ -5870,19 +5886,27 @@
 </ds:datastoreItem>
 </file>
 
+<file path=customXml/itemProps2.xml><?xml version="1.0" encoding="utf-8"?>
+<ds:datastoreItem xmlns:ds="http://schemas.openxmlformats.org/officeDocument/2006/customXml" ds:itemID="{87F1C887-7AFD-4A86-9F7E-A098FD4F3E64}">
+  <ds:schemaRefs>
+    <ds:schemaRef ds:uri="http://schemas.microsoft.com/sharepoint/v3/contenttype/forms"/>
+  </ds:schemaRefs>
+</ds:datastoreItem>
+</file>
+
 <file path=customXml/itemProps3.xml><?xml version="1.0" encoding="utf-8"?>
+<ds:datastoreItem xmlns:ds="http://schemas.openxmlformats.org/officeDocument/2006/customXml" ds:itemID="{9F4D4F50-031C-4960-93C1-D0588EC15168}">
+  <ds:schemaRefs>
+    <ds:schemaRef ds:uri="http://schemas.openxmlformats.org/officeDocument/2006/bibliography"/>
+  </ds:schemaRefs>
+</ds:datastoreItem>
+</file>
+
+<file path=customXml/itemProps4.xml><?xml version="1.0" encoding="utf-8"?>
 <ds:datastoreItem xmlns:ds="http://schemas.openxmlformats.org/officeDocument/2006/customXml" ds:itemID="{CEB7288C-7BD4-44AC-A284-8CCBE665227E}">
   <ds:schemaRefs>
     <ds:schemaRef ds:uri="http://schemas.microsoft.com/office/2006/metadata/properties"/>
     <ds:schemaRef ds:uri="http://schemas.microsoft.com/office/infopath/2007/PartnerControls"/>
   </ds:schemaRefs>
 </ds:datastoreItem>
-</file>
-
-<file path=customXml/itemProps4.xml><?xml version="1.0" encoding="utf-8"?>
-<ds:datastoreItem xmlns:ds="http://schemas.openxmlformats.org/officeDocument/2006/customXml" ds:itemID="{9F4D4F50-031C-4960-93C1-D0588EC15168}">
-  <ds:schemaRefs>
-    <ds:schemaRef ds:uri="http://schemas.openxmlformats.org/officeDocument/2006/bibliography"/>
-  </ds:schemaRefs>
-</ds:datastoreItem>
 </file>
</xml_diff>